<commit_message>
docs: :bug: fix bug
</commit_message>
<xml_diff>
--- a/reports/C2/Student #1/S01.docx
+++ b/reports/C2/Student #1/S01.docx
@@ -146,7 +146,7 @@
                   <w:rPr>
                     <w:rFonts w:asciiTheme="majorHAnsi" w:hAnsiTheme="majorHAnsi" w:cstheme="majorHAnsi"/>
                   </w:rPr>
-                  <w:t>1</w:t>
+                  <w:t>2</w:t>
                 </w:r>
                 <w:r>
                   <w:rPr>
@@ -228,7 +228,19 @@
                   <w:rPr>
                     <w:rFonts w:asciiTheme="majorHAnsi" w:hAnsiTheme="majorHAnsi" w:cstheme="majorHAnsi"/>
                   </w:rPr>
-                  <w:t xml:space="preserve"> https://github.com/marrivbec/gii-is-DP2-C1.033.git</w:t>
+                  <w:t xml:space="preserve"> https://github.com/marrivbec/gii-is-DP2-C</w:t>
+                </w:r>
+                <w:r>
+                  <w:rPr>
+                    <w:rFonts w:asciiTheme="majorHAnsi" w:hAnsiTheme="majorHAnsi" w:cstheme="majorHAnsi"/>
+                  </w:rPr>
+                  <w:t>2</w:t>
+                </w:r>
+                <w:r>
+                  <w:rPr>
+                    <w:rFonts w:asciiTheme="majorHAnsi" w:hAnsiTheme="majorHAnsi" w:cstheme="majorHAnsi"/>
+                  </w:rPr>
+                  <w:t>.033.git</w:t>
                 </w:r>
               </w:sdtContent>
             </w:sdt>
@@ -410,13 +422,23 @@
                 <w:lang w:val="es-ES"/>
               </w:rPr>
             </w:pPr>
+            <w:proofErr w:type="spellStart"/>
             <w:r>
               <w:rPr>
                 <w:rFonts w:asciiTheme="majorHAnsi" w:hAnsiTheme="majorHAnsi" w:cstheme="majorHAnsi"/>
                 <w:b/>
                 <w:lang w:val="es-ES"/>
               </w:rPr>
-              <w:t>Name:</w:t>
+              <w:t>Name</w:t>
+            </w:r>
+            <w:proofErr w:type="spellEnd"/>
+            <w:r>
+              <w:rPr>
+                <w:rFonts w:asciiTheme="majorHAnsi" w:hAnsiTheme="majorHAnsi" w:cstheme="majorHAnsi"/>
+                <w:b/>
+                <w:lang w:val="es-ES"/>
+              </w:rPr>
+              <w:t>:</w:t>
             </w:r>
             <w:r>
               <w:rPr>
@@ -603,7 +625,19 @@
                   <w:rPr>
                     <w:rFonts w:asciiTheme="majorHAnsi" w:hAnsiTheme="majorHAnsi" w:cstheme="majorHAnsi"/>
                   </w:rPr>
-                  <w:t xml:space="preserve"> Seville, 17 of February 2025</w:t>
+                  <w:t xml:space="preserve"> Seville, 1 of </w:t>
+                </w:r>
+                <w:r>
+                  <w:rPr>
+                    <w:rFonts w:asciiTheme="majorHAnsi" w:hAnsiTheme="majorHAnsi" w:cstheme="majorHAnsi"/>
+                  </w:rPr>
+                  <w:t>Jul</w:t>
+                </w:r>
+                <w:r>
+                  <w:rPr>
+                    <w:rFonts w:asciiTheme="majorHAnsi" w:hAnsiTheme="majorHAnsi" w:cstheme="majorHAnsi"/>
+                  </w:rPr>
+                  <w:t>y 2025</w:t>
                 </w:r>
               </w:sdtContent>
             </w:sdt>
@@ -3039,25 +3073,109 @@
         <w:rPr>
           <w:lang w:val="es-ES"/>
         </w:rPr>
-        <w:t xml:space="preserve">No puedo borrar un flight recién creado. Populo con sample data &gt; hago login con manager3 &gt; </w:t>
-      </w:r>
+        <w:t xml:space="preserve">No puedo borrar un </w:t>
+      </w:r>
+      <w:proofErr w:type="spellStart"/>
       <w:r>
         <w:rPr>
           <w:lang w:val="es-ES"/>
         </w:rPr>
-        <w:t>creo un flight con los datos que se ven en la captura &gt; cuando intento eliminarlo, me dice que tiene una leg publicada</w:t>
-      </w:r>
+        <w:t>flight</w:t>
+      </w:r>
+      <w:proofErr w:type="spellEnd"/>
       <w:r>
         <w:rPr>
           <w:lang w:val="es-ES"/>
         </w:rPr>
-        <w:t xml:space="preserve"> y que no se puede borrar. Esto no puede ocurrir, primero porque el flight está recién creado, segundo, porque </w:t>
-      </w:r>
+        <w:t xml:space="preserve"> recién creado. Populo con </w:t>
+      </w:r>
+      <w:proofErr w:type="spellStart"/>
       <w:r>
         <w:rPr>
           <w:lang w:val="es-ES"/>
         </w:rPr>
-        <w:t>si consultamos el listado de legs de ese flight, efectivamente, no tiene ninguna.</w:t>
+        <w:t>sample</w:t>
+      </w:r>
+      <w:proofErr w:type="spellEnd"/>
+      <w:r>
+        <w:rPr>
+          <w:lang w:val="es-ES"/>
+        </w:rPr>
+        <w:t xml:space="preserve"> data &gt; hago login con manager3 &gt; </w:t>
+      </w:r>
+      <w:r>
+        <w:rPr>
+          <w:lang w:val="es-ES"/>
+        </w:rPr>
+        <w:t xml:space="preserve">creo un </w:t>
+      </w:r>
+      <w:proofErr w:type="spellStart"/>
+      <w:r>
+        <w:rPr>
+          <w:lang w:val="es-ES"/>
+        </w:rPr>
+        <w:t>flight</w:t>
+      </w:r>
+      <w:proofErr w:type="spellEnd"/>
+      <w:r>
+        <w:rPr>
+          <w:lang w:val="es-ES"/>
+        </w:rPr>
+        <w:t xml:space="preserve"> con los datos que se ven en la captura &gt; cuando intento eliminarlo, me dice que tiene una </w:t>
+      </w:r>
+      <w:proofErr w:type="spellStart"/>
+      <w:r>
+        <w:rPr>
+          <w:lang w:val="es-ES"/>
+        </w:rPr>
+        <w:t>leg</w:t>
+      </w:r>
+      <w:proofErr w:type="spellEnd"/>
+      <w:r>
+        <w:rPr>
+          <w:lang w:val="es-ES"/>
+        </w:rPr>
+        <w:t xml:space="preserve"> publicada</w:t>
+      </w:r>
+      <w:r>
+        <w:rPr>
+          <w:lang w:val="es-ES"/>
+        </w:rPr>
+        <w:t xml:space="preserve"> y que no se puede borrar. Esto no puede ocurrir, primero porque el </w:t>
+      </w:r>
+      <w:proofErr w:type="spellStart"/>
+      <w:r>
+        <w:rPr>
+          <w:lang w:val="es-ES"/>
+        </w:rPr>
+        <w:t>flight</w:t>
+      </w:r>
+      <w:proofErr w:type="spellEnd"/>
+      <w:r>
+        <w:rPr>
+          <w:lang w:val="es-ES"/>
+        </w:rPr>
+        <w:t xml:space="preserve"> está recién creado, segundo, porque </w:t>
+      </w:r>
+      <w:r>
+        <w:rPr>
+          <w:lang w:val="es-ES"/>
+        </w:rPr>
+        <w:t xml:space="preserve">si consultamos el listado de legs de ese </w:t>
+      </w:r>
+      <w:proofErr w:type="spellStart"/>
+      <w:r>
+        <w:rPr>
+          <w:lang w:val="es-ES"/>
+        </w:rPr>
+        <w:t>flight</w:t>
+      </w:r>
+      <w:proofErr w:type="spellEnd"/>
+      <w:r>
+        <w:rPr>
+          <w:lang w:val="es-ES"/>
+        </w:rPr>
+        <w:t>, efectivamente, no tiene ninguna.</w:t>
       </w:r>
     </w:p>
     <w:p>
@@ -3161,11 +3279,13 @@
         <w:pStyle w:val="Comment-Student"/>
         <w:rPr>
           <w:noProof/>
+          <w:lang w:val="es-ES"/>
         </w:rPr>
       </w:pPr>
       <w:r>
         <w:rPr>
           <w:noProof/>
+          <w:lang w:val="es-ES"/>
         </w:rPr>
         <w:t>Corrección:</w:t>
       </w:r>
@@ -3175,17 +3295,19 @@
         <w:pStyle w:val="Comment-Student"/>
         <w:rPr>
           <w:noProof/>
+          <w:lang w:val="es-ES"/>
         </w:rPr>
       </w:pPr>
       <w:r>
         <w:rPr>
           <w:noProof/>
+          <w:lang w:val="es-ES"/>
         </w:rPr>
         <w:drawing>
-          <wp:inline distT="0" distB="0" distL="0" distR="0" wp14:anchorId="1EAF6B2B" wp14:editId="355AF81B">
-            <wp:extent cx="5731510" cy="1010920"/>
+          <wp:inline distT="0" distB="0" distL="0" distR="0" wp14:anchorId="0F20B45D" wp14:editId="1BAEA41D">
+            <wp:extent cx="5731510" cy="942340"/>
             <wp:effectExtent l="0" t="0" r="2540" b="0"/>
-            <wp:docPr id="504921573" name="Picture 1" descr="A computer code on a white background&#10;&#10;AI-generated content may be incorrect."/>
+            <wp:docPr id="1338334417" name="Picture 1" descr="A close-up of a computer screen&#10;&#10;AI-generated content may be incorrect."/>
             <wp:cNvGraphicFramePr>
               <a:graphicFrameLocks xmlns:a="http://schemas.openxmlformats.org/drawingml/2006/main" noChangeAspect="1"/>
             </wp:cNvGraphicFramePr>
@@ -3193,7 +3315,7 @@
               <a:graphicData uri="http://schemas.openxmlformats.org/drawingml/2006/picture">
                 <pic:pic xmlns:pic="http://schemas.openxmlformats.org/drawingml/2006/picture">
                   <pic:nvPicPr>
-                    <pic:cNvPr id="504921573" name="Picture 1" descr="A computer code on a white background&#10;&#10;AI-generated content may be incorrect."/>
+                    <pic:cNvPr id="1338334417" name="Picture 1" descr="A close-up of a computer screen&#10;&#10;AI-generated content may be incorrect."/>
                     <pic:cNvPicPr/>
                   </pic:nvPicPr>
                   <pic:blipFill>
@@ -3205,7 +3327,7 @@
                   <pic:spPr>
                     <a:xfrm>
                       <a:off x="0" y="0"/>
-                      <a:ext cx="5731510" cy="1010920"/>
+                      <a:ext cx="5731510" cy="942340"/>
                     </a:xfrm>
                     <a:prstGeom prst="rect">
                       <a:avLst/>
@@ -3936,7 +4058,15 @@
         <w:pStyle w:val="Requirement-Header"/>
       </w:pPr>
       <w:r>
-        <w:t>Produce a testing report</w:t>
+        <w:t xml:space="preserve">Produce a </w:t>
+      </w:r>
+      <w:proofErr w:type="spellStart"/>
+      <w:r>
+        <w:t>testing</w:t>
+      </w:r>
+      <w:proofErr w:type="spellEnd"/>
+      <w:r>
+        <w:t xml:space="preserve"> report</w:t>
       </w:r>
       <w:r>
         <w:t xml:space="preserve">. </w:t>
@@ -5560,7 +5690,15 @@
         <w:pStyle w:val="Requirement-Header"/>
       </w:pPr>
       <w:r>
-        <w:t>Produce a lint report</w:t>
+        <w:t xml:space="preserve">Produce a </w:t>
+      </w:r>
+      <w:proofErr w:type="spellStart"/>
+      <w:r>
+        <w:t>lint</w:t>
+      </w:r>
+      <w:proofErr w:type="spellEnd"/>
+      <w:r>
+        <w:t xml:space="preserve"> report</w:t>
       </w:r>
       <w:r>
         <w:t xml:space="preserve">. </w:t>
@@ -5831,7 +5969,15 @@
         <w:pStyle w:val="Requirement-Header"/>
       </w:pPr>
       <w:r>
-        <w:t>Produce an analysis report</w:t>
+        <w:t xml:space="preserve">Produce an </w:t>
+      </w:r>
+      <w:proofErr w:type="spellStart"/>
+      <w:r>
+        <w:t>analysis</w:t>
+      </w:r>
+      <w:proofErr w:type="spellEnd"/>
+      <w:r>
+        <w:t xml:space="preserve"> report</w:t>
       </w:r>
       <w:r>
         <w:t xml:space="preserve">. </w:t>
@@ -6282,7 +6428,15 @@
         <w:pStyle w:val="Requirement-Header"/>
       </w:pPr>
       <w:r>
-        <w:t>Produce an analysis report</w:t>
+        <w:t xml:space="preserve">Produce an </w:t>
+      </w:r>
+      <w:proofErr w:type="spellStart"/>
+      <w:r>
+        <w:t>analysis</w:t>
+      </w:r>
+      <w:proofErr w:type="spellEnd"/>
+      <w:r>
+        <w:t xml:space="preserve"> report</w:t>
       </w:r>
       <w:r>
         <w:t xml:space="preserve">. </w:t>
@@ -6727,7 +6881,15 @@
         <w:pStyle w:val="Requirement-Header"/>
       </w:pPr>
       <w:r>
-        <w:t>Produce an analysis report</w:t>
+        <w:t xml:space="preserve">Produce an </w:t>
+      </w:r>
+      <w:proofErr w:type="spellStart"/>
+      <w:r>
+        <w:t>analysis</w:t>
+      </w:r>
+      <w:proofErr w:type="spellEnd"/>
+      <w:r>
+        <w:t xml:space="preserve"> report</w:t>
       </w:r>
       <w:r>
         <w:t xml:space="preserve">. </w:t>
@@ -7032,7 +7194,15 @@
         <w:pStyle w:val="Requirement-Header"/>
       </w:pPr>
       <w:r>
-        <w:t>Produce an analysis report</w:t>
+        <w:t xml:space="preserve">Produce an </w:t>
+      </w:r>
+      <w:proofErr w:type="spellStart"/>
+      <w:r>
+        <w:t>analysis</w:t>
+      </w:r>
+      <w:proofErr w:type="spellEnd"/>
+      <w:r>
+        <w:t xml:space="preserve"> report</w:t>
       </w:r>
       <w:r>
         <w:t xml:space="preserve">. </w:t>
@@ -9093,6 +9263,7 @@
   <w:style w:type="character" w:default="1" w:styleId="DefaultParagraphFont">
     <w:name w:val="Default Paragraph Font"/>
     <w:uiPriority w:val="1"/>
+    <w:semiHidden/>
     <w:unhideWhenUsed/>
   </w:style>
   <w:style w:type="table" w:default="1" w:styleId="TableNormal">
@@ -10780,6 +10951,7 @@
   </w:compat>
   <w:rsids>
     <w:rsidRoot w:val="002707DD"/>
+    <w:rsid w:val="001354E9"/>
     <w:rsid w:val="0013644E"/>
     <w:rsid w:val="00144398"/>
     <w:rsid w:val="001733EE"/>
@@ -10788,6 +10960,7 @@
     <w:rsid w:val="002707DD"/>
     <w:rsid w:val="002B0141"/>
     <w:rsid w:val="003124D9"/>
+    <w:rsid w:val="0032591D"/>
     <w:rsid w:val="00374B2C"/>
     <w:rsid w:val="003803AE"/>
     <w:rsid w:val="003D684A"/>
@@ -10809,6 +10982,7 @@
     <w:rsid w:val="007079BA"/>
     <w:rsid w:val="007465A2"/>
     <w:rsid w:val="00751E87"/>
+    <w:rsid w:val="007920FE"/>
     <w:rsid w:val="00802250"/>
     <w:rsid w:val="008A1472"/>
     <w:rsid w:val="008B1087"/>
@@ -10834,6 +11008,7 @@
     <w:rsid w:val="00D334C0"/>
     <w:rsid w:val="00D53709"/>
     <w:rsid w:val="00D72CB9"/>
+    <w:rsid w:val="00D91A92"/>
     <w:rsid w:val="00DA7CCF"/>
     <w:rsid w:val="00DE124F"/>
     <w:rsid w:val="00E25325"/>

</xml_diff>

<commit_message>
docs: :memo: update doc
</commit_message>
<xml_diff>
--- a/reports/C2/Student #1/S01.docx
+++ b/reports/C2/Student #1/S01.docx
@@ -1124,21 +1124,7 @@
         <w:rPr>
           <w:lang w:val="en-GB"/>
         </w:rPr>
-        <w:t xml:space="preserve">Provide a link to your planning dashboard in GitHub to review the tasks, their </w:t>
-      </w:r>
-      <w:proofErr w:type="gramStart"/>
-      <w:r>
-        <w:rPr>
-          <w:lang w:val="en-GB"/>
-        </w:rPr>
-        <w:t>current status</w:t>
-      </w:r>
-      <w:proofErr w:type="gramEnd"/>
-      <w:r>
-        <w:rPr>
-          <w:lang w:val="en-GB"/>
-        </w:rPr>
-        <w:t>, and your schedule</w:t>
+        <w:t>Provide a link to your planning dashboard in GitHub to review the tasks, their current status, and your schedule</w:t>
       </w:r>
       <w:r>
         <w:rPr>
@@ -1998,14 +1984,7 @@
         <w:rPr>
           <w:lang w:val="en-GB"/>
         </w:rPr>
-        <w:t xml:space="preserve"> </w:t>
-      </w:r>
-      <w:proofErr w:type="gramStart"/>
-      <w:r>
-        <w:rPr>
-          <w:lang w:val="en-GB"/>
-        </w:rPr>
-        <w:t xml:space="preserve">unique </w:t>
+        <w:t xml:space="preserve"> unique </w:t>
       </w:r>
       <w:r>
         <w:rPr>
@@ -2019,16 +1998,7 @@
           <w:bCs/>
           <w:lang w:val="en-GB"/>
         </w:rPr>
-        <w:t>flight</w:t>
-      </w:r>
-      <w:proofErr w:type="gramEnd"/>
-      <w:r>
-        <w:rPr>
-          <w:b/>
-          <w:bCs/>
-          <w:lang w:val="en-GB"/>
-        </w:rPr>
-        <w:t xml:space="preserve"> number</w:t>
+        <w:t>flight number</w:t>
       </w:r>
       <w:r>
         <w:rPr>
@@ -2696,21 +2666,7 @@
         <w:rPr>
           <w:lang w:val="en-GB"/>
         </w:rPr>
-        <w:t xml:space="preserve">Provide a link to your planning dashboard in GitHub to review the tasks, their </w:t>
-      </w:r>
-      <w:proofErr w:type="gramStart"/>
-      <w:r>
-        <w:rPr>
-          <w:lang w:val="en-GB"/>
-        </w:rPr>
-        <w:t>current status</w:t>
-      </w:r>
-      <w:proofErr w:type="gramEnd"/>
-      <w:r>
-        <w:rPr>
-          <w:lang w:val="en-GB"/>
-        </w:rPr>
-        <w:t>, and your schedule</w:t>
+        <w:t>Provide a link to your planning dashboard in GitHub to review the tasks, their current status, and your schedule</w:t>
       </w:r>
       <w:r>
         <w:rPr>
@@ -2970,15 +2926,7 @@
         <w:t xml:space="preserve">Flights </w:t>
       </w:r>
       <w:r>
-        <w:t xml:space="preserve">can be updated or deleted </w:t>
-      </w:r>
-      <w:proofErr w:type="gramStart"/>
-      <w:r>
-        <w:t>as long as</w:t>
-      </w:r>
-      <w:proofErr w:type="gramEnd"/>
-      <w:r>
-        <w:t xml:space="preserve"> they have not been published</w:t>
+        <w:t>can be updated or deleted as long as they have not been published</w:t>
       </w:r>
       <w:r>
         <w:t xml:space="preserve">. </w:t>
@@ -3509,15 +3457,7 @@
         <w:t>leg</w:t>
       </w:r>
       <w:r>
-        <w:t xml:space="preserve"> </w:t>
-      </w:r>
-      <w:proofErr w:type="gramStart"/>
-      <w:r>
-        <w:t>as long as</w:t>
-      </w:r>
-      <w:proofErr w:type="gramEnd"/>
-      <w:r>
-        <w:t xml:space="preserve"> it is not published</w:t>
+        <w:t xml:space="preserve"> as long as it is not published</w:t>
       </w:r>
       <w:r>
         <w:t xml:space="preserve">. </w:t>
@@ -3649,21 +3589,7 @@
         <w:rPr>
           <w:lang w:val="en-GB"/>
         </w:rPr>
-        <w:t xml:space="preserve">Provide a link to your planning dashboard in GitHub to review the tasks, their </w:t>
-      </w:r>
-      <w:proofErr w:type="gramStart"/>
-      <w:r>
-        <w:rPr>
-          <w:lang w:val="en-GB"/>
-        </w:rPr>
-        <w:t>current status</w:t>
-      </w:r>
-      <w:proofErr w:type="gramEnd"/>
-      <w:r>
-        <w:rPr>
-          <w:lang w:val="en-GB"/>
-        </w:rPr>
-        <w:t>, and your schedule</w:t>
+        <w:t>Provide a link to your planning dashboard in GitHub to review the tasks, their current status, and your schedule</w:t>
       </w:r>
       <w:r>
         <w:rPr>
@@ -3992,21 +3918,7 @@
         <w:rPr>
           <w:lang w:val="en-GB"/>
         </w:rPr>
-        <w:t xml:space="preserve">Provide a link to your planning dashboard in GitHub to review the tasks, their </w:t>
-      </w:r>
-      <w:proofErr w:type="gramStart"/>
-      <w:r>
-        <w:rPr>
-          <w:lang w:val="en-GB"/>
-        </w:rPr>
-        <w:t>current status</w:t>
-      </w:r>
-      <w:proofErr w:type="gramEnd"/>
-      <w:r>
-        <w:rPr>
-          <w:lang w:val="en-GB"/>
-        </w:rPr>
-        <w:t>, and your schedule</w:t>
+        <w:t>Provide a link to your planning dashboard in GitHub to review the tasks, their current status, and your schedule</w:t>
       </w:r>
       <w:r>
         <w:rPr>
@@ -4509,15 +4421,7 @@
         <w:pStyle w:val="Requirement-Body"/>
       </w:pPr>
       <w:r>
-        <w:t xml:space="preserve">The number of years to retire, </w:t>
-      </w:r>
-      <w:proofErr w:type="gramStart"/>
-      <w:r>
-        <w:t>assuming that</w:t>
-      </w:r>
-      <w:proofErr w:type="gramEnd"/>
-      <w:r>
-        <w:t xml:space="preserve"> </w:t>
+        <w:t xml:space="preserve">The number of years to retire, assuming that </w:t>
       </w:r>
       <w:r>
         <w:t xml:space="preserve">they </w:t>
@@ -4559,13 +4463,8 @@
       <w:r>
         <w:t xml:space="preserve"> An airport is popular </w:t>
       </w:r>
-      <w:proofErr w:type="gramStart"/>
-      <w:r>
-        <w:t>as long as</w:t>
-      </w:r>
-      <w:proofErr w:type="gramEnd"/>
-      <w:r>
-        <w:t xml:space="preserve"> </w:t>
+      <w:r>
+        <w:t xml:space="preserve">as long as </w:t>
       </w:r>
       <w:r>
         <w:t xml:space="preserve">it has been an origin or destination </w:t>
@@ -5442,7 +5341,13 @@
         </w:sdtPr>
         <w:sdtContent>
           <w:r>
-            <w:t xml:space="preserve">    </w:t>
+            <w:t xml:space="preserve"> </w:t>
+          </w:r>
+          <w:r>
+            <w:t>X</w:t>
+          </w:r>
+          <w:r>
+            <w:t xml:space="preserve"> </w:t>
           </w:r>
         </w:sdtContent>
       </w:sdt>
@@ -10995,6 +10900,7 @@
     <w:rsid w:val="00AD7444"/>
     <w:rsid w:val="00AE0F65"/>
     <w:rsid w:val="00B30056"/>
+    <w:rsid w:val="00B34650"/>
     <w:rsid w:val="00B41EEB"/>
     <w:rsid w:val="00B50831"/>
     <w:rsid w:val="00BB57C2"/>
@@ -11010,6 +10916,7 @@
     <w:rsid w:val="00D72CB9"/>
     <w:rsid w:val="00D91A92"/>
     <w:rsid w:val="00DA7CCF"/>
+    <w:rsid w:val="00DD54BA"/>
     <w:rsid w:val="00DE124F"/>
     <w:rsid w:val="00E25325"/>
     <w:rsid w:val="00E331ED"/>

</xml_diff>